<commit_message>
feat(links): replace Anis Creation with LinkedIn across website and resume, keeping only the 5 required primary links
</commit_message>
<xml_diff>
--- a/public/assets/Rohith_E_Resume.docx
+++ b/public/assets/Rohith_E_Resume.docx
@@ -85,7 +85,7 @@
         <w:r>
           <w:rPr>
             <w:rFonts w:ascii="Calibri" w:hAnsi="Calibri"/>
-            <w:sz w:val="20"/>
+            <w:sz w:val="19"/>
             <w:color w:val="0969DA"/>
             <w:u w:val="single"/>
           </w:rPr>
@@ -98,7 +98,7 @@
           <w:b w:val="0"/>
           <w:i w:val="0"/>
           <w:color w:val="444444"/>
-          <w:sz w:val="20"/>
+          <w:sz w:val="19"/>
         </w:rPr>
         <w:t xml:space="preserve">  |  </w:t>
       </w:r>
@@ -106,7 +106,28 @@
         <w:r>
           <w:rPr>
             <w:rFonts w:ascii="Calibri" w:hAnsi="Calibri"/>
-            <w:sz w:val="20"/>
+            <w:sz w:val="19"/>
+            <w:color w:val="0969DA"/>
+            <w:u w:val="single"/>
+          </w:rPr>
+          <w:t xml:space="preserve">linkedin.com/in/rohith-elayaraja</w:t>
+        </w:r>
+      </w:hyperlink>
+      <w:r>
+        <w:rPr>
+          <w:rFonts w:ascii="Calibri" w:hAnsi="Calibri"/>
+          <w:b w:val="0"/>
+          <w:i w:val="0"/>
+          <w:color w:val="444444"/>
+          <w:sz w:val="19"/>
+        </w:rPr>
+        <w:t xml:space="preserve">  |  </w:t>
+      </w:r>
+      <w:hyperlink r:id="rId13">
+        <w:r>
+          <w:rPr>
+            <w:rFonts w:ascii="Calibri" w:hAnsi="Calibri"/>
+            <w:sz w:val="19"/>
             <w:color w:val="0969DA"/>
             <w:u w:val="single"/>
           </w:rPr>
@@ -119,15 +140,15 @@
           <w:b w:val="0"/>
           <w:i w:val="0"/>
           <w:color w:val="444444"/>
-          <w:sz w:val="20"/>
+          <w:sz w:val="19"/>
         </w:rPr>
         <w:t xml:space="preserve">  |  </w:t>
       </w:r>
-      <w:hyperlink r:id="rId13">
+      <w:hyperlink r:id="rId14">
         <w:r>
           <w:rPr>
             <w:rFonts w:ascii="Calibri" w:hAnsi="Calibri"/>
-            <w:sz w:val="20"/>
+            <w:sz w:val="19"/>
             <w:color w:val="0969DA"/>
             <w:u w:val="single"/>
           </w:rPr>
@@ -522,27 +543,6 @@
         <w:t xml:space="preserve">Live: </w:t>
       </w:r>
       <w:hyperlink r:id="rId14">
-        <w:r>
-          <w:rPr>
-            <w:rFonts w:ascii="Calibri" w:hAnsi="Calibri"/>
-            <w:sz w:val="20"/>
-            <w:color w:val="0969DA"/>
-            <w:u w:val="single"/>
-          </w:rPr>
-          <w:t xml:space="preserve">anis-creation.vercel.app</w:t>
-        </w:r>
-      </w:hyperlink>
-      <w:r>
-        <w:rPr>
-          <w:rFonts w:ascii="Calibri" w:hAnsi="Calibri"/>
-          <w:b w:val="0"/>
-          <w:i w:val="0"/>
-          <w:color w:val="444444"/>
-          <w:sz w:val="20"/>
-        </w:rPr>
-        <w:t xml:space="preserve">  |  </w:t>
-      </w:r>
-      <w:hyperlink r:id="rId13">
         <w:r>
           <w:rPr>
             <w:rFonts w:ascii="Calibri" w:hAnsi="Calibri"/>
@@ -1000,7 +1000,7 @@
         </w:rPr>
         <w:t xml:space="preserve">Solved 315+ Data Structures and Algorithms problems on </w:t>
       </w:r>
-      <w:hyperlink r:id="rId12">
+      <w:hyperlink r:id="rId13">
         <w:r>
           <w:rPr>
             <w:rFonts w:ascii="Calibri" w:hAnsi="Calibri"/>

</xml_diff>

<commit_message>
chore: align all external links strictly with Rohith_E_Master_Resume.pdf
</commit_message>
<xml_diff>
--- a/public/assets/Rohith_E_Resume.docx
+++ b/public/assets/Rohith_E_Resume.docx
@@ -110,7 +110,7 @@
             <w:color w:val="0969DA"/>
             <w:u w:val="single"/>
           </w:rPr>
-          <w:t xml:space="preserve">linkedin.com/in/rohith-elayaraja</w:t>
+          <w:t xml:space="preserve">leetcode.com/Shinchan_2007</w:t>
         </w:r>
       </w:hyperlink>
       <w:r>
@@ -124,27 +124,6 @@
         <w:t xml:space="preserve">  |  </w:t>
       </w:r>
       <w:hyperlink r:id="rId13">
-        <w:r>
-          <w:rPr>
-            <w:rFonts w:ascii="Calibri" w:hAnsi="Calibri"/>
-            <w:sz w:val="19"/>
-            <w:color w:val="0969DA"/>
-            <w:u w:val="single"/>
-          </w:rPr>
-          <w:t xml:space="preserve">leetcode.com/Shinchan_2007</w:t>
-        </w:r>
-      </w:hyperlink>
-      <w:r>
-        <w:rPr>
-          <w:rFonts w:ascii="Calibri" w:hAnsi="Calibri"/>
-          <w:b w:val="0"/>
-          <w:i w:val="0"/>
-          <w:color w:val="444444"/>
-          <w:sz w:val="19"/>
-        </w:rPr>
-        <w:t xml:space="preserve">  |  </w:t>
-      </w:r>
-      <w:hyperlink r:id="rId14">
         <w:r>
           <w:rPr>
             <w:rFonts w:ascii="Calibri" w:hAnsi="Calibri"/>
@@ -550,6 +529,27 @@
             <w:color w:val="0969DA"/>
             <w:u w:val="single"/>
           </w:rPr>
+          <w:t xml:space="preserve">anis-creation.vercel.app</w:t>
+        </w:r>
+      </w:hyperlink>
+      <w:r>
+        <w:rPr>
+          <w:rFonts w:ascii="Calibri" w:hAnsi="Calibri"/>
+          <w:b w:val="0"/>
+          <w:i w:val="0"/>
+          <w:color w:val="444444"/>
+          <w:sz w:val="20"/>
+        </w:rPr>
+        <w:t xml:space="preserve">  |  </w:t>
+      </w:r>
+      <w:hyperlink r:id="rId13">
+        <w:r>
+          <w:rPr>
+            <w:rFonts w:ascii="Calibri" w:hAnsi="Calibri"/>
+            <w:sz w:val="20"/>
+            <w:color w:val="0969DA"/>
+            <w:u w:val="single"/>
+          </w:rPr>
           <w:t xml:space="preserve">rohith-digital-x-xi.vercel.app</w:t>
         </w:r>
       </w:hyperlink>
@@ -942,28 +942,7 @@
           <w:color w:val="222222"/>
           <w:sz w:val="20"/>
         </w:rPr>
-        <w:t xml:space="preserve">Added Windows regression tests for scratch-path handling; the fix was reviewed and merged upstream in </w:t>
-      </w:r>
-      <w:hyperlink r:id="rId19">
-        <w:r>
-          <w:rPr>
-            <w:rFonts w:ascii="Calibri" w:hAnsi="Calibri"/>
-            <w:sz w:val="20"/>
-            <w:color w:val="0969DA"/>
-            <w:u w:val="single"/>
-          </w:rPr>
-          <w:t xml:space="preserve">PR #70</w:t>
-        </w:r>
-      </w:hyperlink>
-      <w:r>
-        <w:rPr>
-          <w:rFonts w:ascii="Calibri" w:hAnsi="Calibri"/>
-          <w:b w:val="0"/>
-          <w:i w:val="0"/>
-          <w:color w:val="222222"/>
-          <w:sz w:val="20"/>
-        </w:rPr>
-        <w:t>.</w:t>
+        <w:t>Added Windows regression tests for scratch-path handling; the fix was reviewed and merged upstream in PR #70.</w:t>
       </w:r>
     </w:p>
     <w:p>
@@ -1000,7 +979,7 @@
         </w:rPr>
         <w:t xml:space="preserve">Solved 315+ Data Structures and Algorithms problems on </w:t>
       </w:r>
-      <w:hyperlink r:id="rId13">
+      <w:hyperlink r:id="rId12">
         <w:r>
           <w:rPr>
             <w:rFonts w:ascii="Calibri" w:hAnsi="Calibri"/>

</xml_diff>

<commit_message>
fix(links): replace Anis Creation profile card with LinkedIn, keep share link in experience, and update freelancer label to digital
</commit_message>
<xml_diff>
--- a/public/assets/Rohith_E_Resume.docx
+++ b/public/assets/Rohith_E_Resume.docx
@@ -110,6 +110,27 @@
             <w:color w:val="0969DA"/>
             <w:u w:val="single"/>
           </w:rPr>
+          <w:t xml:space="preserve">linkedin.com/in/rohith-elayaraja</w:t>
+        </w:r>
+      </w:hyperlink>
+      <w:r>
+        <w:rPr>
+          <w:rFonts w:ascii="Calibri" w:hAnsi="Calibri"/>
+          <w:b w:val="0"/>
+          <w:i w:val="0"/>
+          <w:color w:val="444444"/>
+          <w:sz w:val="19"/>
+        </w:rPr>
+        <w:t xml:space="preserve">  |  </w:t>
+      </w:r>
+      <w:hyperlink r:id="rId13">
+        <w:r>
+          <w:rPr>
+            <w:rFonts w:ascii="Calibri" w:hAnsi="Calibri"/>
+            <w:sz w:val="19"/>
+            <w:color w:val="0969DA"/>
+            <w:u w:val="single"/>
+          </w:rPr>
           <w:t xml:space="preserve">leetcode.com/Shinchan_2007</w:t>
         </w:r>
       </w:hyperlink>
@@ -123,7 +144,7 @@
         </w:rPr>
         <w:t xml:space="preserve">  |  </w:t>
       </w:r>
-      <w:hyperlink r:id="rId13">
+      <w:hyperlink r:id="rId14">
         <w:r>
           <w:rPr>
             <w:rFonts w:ascii="Calibri" w:hAnsi="Calibri"/>
@@ -446,7 +467,7 @@
           <w:color w:val="111111"/>
           <w:sz w:val="20"/>
         </w:rPr>
-        <w:t>Freelance Software Developer - Rohith Digital X</w:t>
+        <w:t>Software Developer - Rohith Digital X</w:t>
       </w:r>
       <w:r>
         <w:rPr>
@@ -521,7 +542,7 @@
         </w:rPr>
         <w:t xml:space="preserve">Live: </w:t>
       </w:r>
-      <w:hyperlink r:id="rId14">
+      <w:hyperlink r:id="rId15">
         <w:r>
           <w:rPr>
             <w:rFonts w:ascii="Calibri" w:hAnsi="Calibri"/>
@@ -542,7 +563,7 @@
         </w:rPr>
         <w:t xml:space="preserve">  |  </w:t>
       </w:r>
-      <w:hyperlink r:id="rId13">
+      <w:hyperlink r:id="rId14">
         <w:r>
           <w:rPr>
             <w:rFonts w:ascii="Calibri" w:hAnsi="Calibri"/>
@@ -620,7 +641,7 @@
         </w:rPr>
         <w:t xml:space="preserve">GitHub: </w:t>
       </w:r>
-      <w:hyperlink r:id="rId15">
+      <w:hyperlink r:id="rId16">
         <w:r>
           <w:rPr>
             <w:rFonts w:ascii="Calibri" w:hAnsi="Calibri"/>
@@ -711,7 +732,7 @@
         </w:rPr>
         <w:t xml:space="preserve">GitHub: </w:t>
       </w:r>
-      <w:hyperlink r:id="rId16">
+      <w:hyperlink r:id="rId17">
         <w:r>
           <w:rPr>
             <w:rFonts w:ascii="Calibri" w:hAnsi="Calibri"/>
@@ -807,7 +828,7 @@
         </w:rPr>
         <w:t xml:space="preserve">GitHub: </w:t>
       </w:r>
-      <w:hyperlink r:id="rId17">
+      <w:hyperlink r:id="rId18">
         <w:r>
           <w:rPr>
             <w:rFonts w:ascii="Calibri" w:hAnsi="Calibri"/>
@@ -901,7 +922,7 @@
         </w:rPr>
         <w:t xml:space="preserve">GitHub: </w:t>
       </w:r>
-      <w:hyperlink r:id="rId18">
+      <w:hyperlink r:id="rId19">
         <w:r>
           <w:rPr>
             <w:rFonts w:ascii="Calibri" w:hAnsi="Calibri"/>
@@ -979,7 +1000,7 @@
         </w:rPr>
         <w:t xml:space="preserve">Solved 315+ Data Structures and Algorithms problems on </w:t>
       </w:r>
-      <w:hyperlink r:id="rId12">
+      <w:hyperlink r:id="rId13">
         <w:r>
           <w:rPr>
             <w:rFonts w:ascii="Calibri" w:hAnsi="Calibri"/>

</xml_diff>